<commit_message>
fix: enforce Persian leading zero in Stage 4.0 data curation artifacts
</commit_message>
<xml_diff>
--- a/projects/study_vertical_slice_experimental/academic-state/outputs/00_data_curation_report.docx
+++ b/projects/study_vertical_slice_experimental/academic-state/outputs/00_data_curation_report.docx
@@ -130,7 +130,7 @@
           <w:rFonts w:ascii="B Nazanin" w:hAnsi="B Nazanin" w:cs="B Nazanin"/>
           <w:rtl/>
         </w:rPr>
-        <w:t>ارزیابی داده‌های خام نشان داد که هیچ‌گونه داده گمشده‌ای در ماتریس داده‌ها (۶۰ سطر در ۴۱ ستون) وجود ندارد. تعداد خانه‌های گمشده برابر صفر و نرخ مفقودی کل ۰.۰٪ است. با تقریب الگوریتم بیشینه‌سازی امید ریاضی (EM)، آماره کای‌دو آزمون لیتل برابر با ۱۴.۳۲ با درجات آزادی ۱۵ محاسبه گردید که در سطح خطای ۰.۰۵ معنادار نیست (χ²(15) = 14.32, p = 0.428). با عنایت به عدم معناداری آزمون لیتل و نرخ مفقودی صفر، هیچ‌گونه نقض فرضیه مفقودی تصادفی کامل (MCAR) رخ نداده است.</w:t>
+        <w:t>ارزیابی داده‌های خام نشان داد که هیچ‌گونه داده گمشده‌ای در ماتریس داده‌ها (۶۰ سطر در ۴۱ ستون) وجود ندارد. تعداد خانه‌های گمشده برابر صفر و نرخ مفقودی کل ۰.۰٪ است. با تقریب الگوریتم بیشینه‌سازی امید ریاضی (EM)، آماره کای‌دو آزمون لیتل برابر با ۱۴.۳۲ با درجات آزادی ۱۵ محاسبه گردید که در سطح خطای ۰.۰۵ معنادار نیست (χ²(15) = 14.32, p = 0.428). با عنایت به عدم معناداری آزمون لیتل (p &gt; 0.05) و نرخ مفقودی صفر، هیچ‌گونه نقض فرضیه مفقودی تصادفی کامل (MCAR) رخ نداده است.</w:t>
       </w:r>
     </w:p>
     <w:p>
@@ -196,7 +196,7 @@
           <w:rFonts w:ascii="B Nazanin" w:hAnsi="B Nazanin" w:cs="B Nazanin"/>
           <w:rtl/>
         </w:rPr>
-        <w:t>فاصله ماهالانوبیس (D²) برای تمامی ۶۰ آزمودنی محاسبه و با توزیع کای‌دو در سطح آستانه سخت‌گیرانه α = .001 مقایسه شد. هیچ موردی فراتر از آستانه بحرانی مشاهده نشد و تعداد داده‌های پرت چندمتغیره صفر است. بنابراین، حجم نمونه نهایی در تمامی تحلیل‌ها بر روی ۶۰ نفر تثبیت گردید.</w:t>
+        <w:t>فاصله ماهالانوبیس (D²) برای تمامی ۶۰ آزمودنی محاسبه و با توزیع کای‌دو در سطح آستانه سخت‌گیرانه α = 0.001 مقایسه شد. هیچ موردی فراتر از آستانه بحرانی مشاهده نشد و تعداد داده‌های پرت چندمتغیره صفر است. بنابراین، حجم نمونه نهایی در تمامی تحلیل‌ها بر روی ۶۰ نفر تثبیت گردید.</w:t>
       </w:r>
     </w:p>
     <w:p>

</xml_diff>